<commit_message>
docs[backend]: update approach for backend iam microservice
</commit_message>
<xml_diff>
--- a/docs/backend/movie-reservation-system_backend-architecture.docx
+++ b/docs/backend/movie-reservation-system_backend-architecture.docx
@@ -35,6 +35,7 @@
         </w:rPr>
         <w:t xml:space="preserve">Version </w:t>
       </w:r>
+      <w:proofErr w:type="gramStart"/>
       <w:r>
         <w:rPr>
           <w:color w:val="888888"/>
@@ -45,7 +46,14 @@
         <w:rPr>
           <w:color w:val="888888"/>
         </w:rPr>
-        <w:t>.0  |  2026</w:t>
+        <w:t>.0  |</w:t>
+      </w:r>
+      <w:proofErr w:type="gramEnd"/>
+      <w:r>
+        <w:rPr>
+          <w:color w:val="888888"/>
+        </w:rPr>
+        <w:t xml:space="preserve">  2026</w:t>
       </w:r>
     </w:p>
     <w:p>
@@ -69,16 +77,15 @@
     </w:p>
     <w:p>
       <w:r>
-        <w:t>Movie Reservation System</w:t>
-      </w:r>
-      <w:r>
-        <w:t xml:space="preserve"> is a cinema management platform for ticket reservations, seat management, and payment processing</w:t>
-      </w:r>
-      <w:r>
-        <w:t xml:space="preserve"> (mock)</w:t>
-      </w:r>
-      <w:r>
-        <w:t>. The system is implemented as four loosely-coupled microservices communicating via REST, with asynchronous workflows handled through an event bus.</w:t>
+        <w:t xml:space="preserve">Movie Reservation System is a cinema management platform for ticket reservations, seat management, and payment processing (mock). The system is implemented as four </w:t>
+      </w:r>
+      <w:proofErr w:type="gramStart"/>
+      <w:r>
+        <w:t>loosely-coupled</w:t>
+      </w:r>
+      <w:proofErr w:type="gramEnd"/>
+      <w:r>
+        <w:t xml:space="preserve"> microservices communicating via REST, with asynchronous workflows handled through an event bus.</w:t>
       </w:r>
     </w:p>
     <w:p/>
@@ -119,12 +126,6 @@
         <w:gridCol w:w="3120"/>
       </w:tblGrid>
       <w:tr>
-        <w:tblPrEx>
-          <w:tblCellMar>
-            <w:top w:w="0" w:type="dxa"/>
-            <w:bottom w:w="0" w:type="dxa"/>
-          </w:tblCellMar>
-        </w:tblPrEx>
         <w:trPr>
           <w:tblHeader/>
         </w:trPr>
@@ -223,12 +224,6 @@
         </w:tc>
       </w:tr>
       <w:tr>
-        <w:tblPrEx>
-          <w:tblCellMar>
-            <w:top w:w="0" w:type="dxa"/>
-            <w:bottom w:w="0" w:type="dxa"/>
-          </w:tblCellMar>
-        </w:tblPrEx>
         <w:tc>
           <w:tcPr>
             <w:tcW w:w="3120" w:type="dxa"/>
@@ -329,23 +324,35 @@
               </w:rPr>
               <w:t xml:space="preserve">Django </w:t>
             </w:r>
-            <w:r>
-              <w:rPr>
-                <w:sz w:val="20"/>
-                <w:szCs w:val="20"/>
-              </w:rPr>
-              <w:t>AbstractUser), Role, RefreshToken</w:t>
-            </w:r>
+            <w:proofErr w:type="spellStart"/>
+            <w:r>
+              <w:rPr>
+                <w:sz w:val="20"/>
+                <w:szCs w:val="20"/>
+              </w:rPr>
+              <w:t>AbstractUser</w:t>
+            </w:r>
+            <w:proofErr w:type="spellEnd"/>
+            <w:r>
+              <w:rPr>
+                <w:sz w:val="20"/>
+                <w:szCs w:val="20"/>
+              </w:rPr>
+              <w:t xml:space="preserve">), Role, </w:t>
+            </w:r>
+            <w:proofErr w:type="spellStart"/>
+            <w:r>
+              <w:rPr>
+                <w:sz w:val="20"/>
+                <w:szCs w:val="20"/>
+              </w:rPr>
+              <w:t>RefreshToken</w:t>
+            </w:r>
+            <w:proofErr w:type="spellEnd"/>
           </w:p>
         </w:tc>
       </w:tr>
       <w:tr>
-        <w:tblPrEx>
-          <w:tblCellMar>
-            <w:top w:w="0" w:type="dxa"/>
-            <w:bottom w:w="0" w:type="dxa"/>
-          </w:tblCellMar>
-        </w:tblPrEx>
         <w:tc>
           <w:tcPr>
             <w:tcW w:w="3120" w:type="dxa"/>
@@ -429,12 +436,6 @@
         </w:tc>
       </w:tr>
       <w:tr>
-        <w:tblPrEx>
-          <w:tblCellMar>
-            <w:top w:w="0" w:type="dxa"/>
-            <w:bottom w:w="0" w:type="dxa"/>
-          </w:tblCellMar>
-        </w:tblPrEx>
         <w:tc>
           <w:tcPr>
             <w:tcW w:w="3120" w:type="dxa"/>
@@ -512,18 +513,69 @@
                 <w:sz w:val="20"/>
                 <w:szCs w:val="20"/>
               </w:rPr>
-              <w:t>Movie, Genre, Showtime, CinemaRoom, CinemaRoomRow, CinemaRoomSeat, TicketType</w:t>
-            </w:r>
+              <w:t xml:space="preserve">Movie, Genre, Showtime, </w:t>
+            </w:r>
+            <w:proofErr w:type="spellStart"/>
+            <w:r>
+              <w:rPr>
+                <w:sz w:val="20"/>
+                <w:szCs w:val="20"/>
+              </w:rPr>
+              <w:t>CinemaRoom</w:t>
+            </w:r>
+            <w:proofErr w:type="spellEnd"/>
+            <w:r>
+              <w:rPr>
+                <w:sz w:val="20"/>
+                <w:szCs w:val="20"/>
+              </w:rPr>
+              <w:t xml:space="preserve">, </w:t>
+            </w:r>
+            <w:proofErr w:type="spellStart"/>
+            <w:r>
+              <w:rPr>
+                <w:sz w:val="20"/>
+                <w:szCs w:val="20"/>
+              </w:rPr>
+              <w:t>CinemaRoomRow</w:t>
+            </w:r>
+            <w:proofErr w:type="spellEnd"/>
+            <w:r>
+              <w:rPr>
+                <w:sz w:val="20"/>
+                <w:szCs w:val="20"/>
+              </w:rPr>
+              <w:t xml:space="preserve">, </w:t>
+            </w:r>
+            <w:proofErr w:type="spellStart"/>
+            <w:r>
+              <w:rPr>
+                <w:sz w:val="20"/>
+                <w:szCs w:val="20"/>
+              </w:rPr>
+              <w:t>CinemaRoomSeat</w:t>
+            </w:r>
+            <w:proofErr w:type="spellEnd"/>
+            <w:r>
+              <w:rPr>
+                <w:sz w:val="20"/>
+                <w:szCs w:val="20"/>
+              </w:rPr>
+              <w:t xml:space="preserve">, </w:t>
+            </w:r>
+            <w:proofErr w:type="spellStart"/>
+            <w:r>
+              <w:rPr>
+                <w:sz w:val="20"/>
+                <w:szCs w:val="20"/>
+              </w:rPr>
+              <w:t>TicketType</w:t>
+            </w:r>
+            <w:proofErr w:type="spellEnd"/>
           </w:p>
         </w:tc>
       </w:tr>
       <w:tr>
-        <w:tblPrEx>
-          <w:tblCellMar>
-            <w:top w:w="0" w:type="dxa"/>
-            <w:bottom w:w="0" w:type="dxa"/>
-          </w:tblCellMar>
-        </w:tblPrEx>
         <w:tc>
           <w:tcPr>
             <w:tcW w:w="3120" w:type="dxa"/>
@@ -615,8 +667,17 @@
                 <w:sz w:val="20"/>
                 <w:szCs w:val="20"/>
               </w:rPr>
-              <w:t>Reservation, ReservationTicket</w:t>
-            </w:r>
+              <w:t xml:space="preserve">Reservation, </w:t>
+            </w:r>
+            <w:proofErr w:type="spellStart"/>
+            <w:r>
+              <w:rPr>
+                <w:sz w:val="20"/>
+                <w:szCs w:val="20"/>
+              </w:rPr>
+              <w:t>ReservationTicket</w:t>
+            </w:r>
+            <w:proofErr w:type="spellEnd"/>
           </w:p>
         </w:tc>
       </w:tr>
@@ -652,7 +713,15 @@
       </w:pPr>
       <w:r>
         <w:lastRenderedPageBreak/>
-        <w:t>Asynchronous events — used for state transitions that fan out to multiple consumers (e.g. PaymentSucceeded → trigger ticket generation + email delivery)</w:t>
+        <w:t xml:space="preserve">Asynchronous events — used for state transitions that fan out to multiple consumers (e.g. </w:t>
+      </w:r>
+      <w:proofErr w:type="spellStart"/>
+      <w:r>
+        <w:t>PaymentSucceeded</w:t>
+      </w:r>
+      <w:proofErr w:type="spellEnd"/>
+      <w:r>
+        <w:t xml:space="preserve"> → trigger ticket generation + email delivery)</w:t>
       </w:r>
     </w:p>
     <w:p>
@@ -745,12 +814,6 @@
         <w:gridCol w:w="3120"/>
       </w:tblGrid>
       <w:tr>
-        <w:tblPrEx>
-          <w:tblCellMar>
-            <w:top w:w="0" w:type="dxa"/>
-            <w:bottom w:w="0" w:type="dxa"/>
-          </w:tblCellMar>
-        </w:tblPrEx>
         <w:trPr>
           <w:tblHeader/>
         </w:trPr>
@@ -849,12 +912,6 @@
         </w:tc>
       </w:tr>
       <w:tr>
-        <w:tblPrEx>
-          <w:tblCellMar>
-            <w:top w:w="0" w:type="dxa"/>
-            <w:bottom w:w="0" w:type="dxa"/>
-          </w:tblCellMar>
-        </w:tblPrEx>
         <w:tc>
           <w:tcPr>
             <w:tcW w:w="3120" w:type="dxa"/>
@@ -927,23 +984,72 @@
             </w:tcMar>
           </w:tcPr>
           <w:p>
-            <w:r>
-              <w:rPr>
-                <w:sz w:val="20"/>
-                <w:szCs w:val="20"/>
-              </w:rPr>
-              <w:t>User.id from IAM service — uuid primary key on the iam_user table</w:t>
+            <w:proofErr w:type="spellStart"/>
+            <w:r>
+              <w:rPr>
+                <w:sz w:val="20"/>
+                <w:szCs w:val="20"/>
+              </w:rPr>
+              <w:t>User.</w:t>
+            </w:r>
+            <w:r>
+              <w:rPr>
+                <w:sz w:val="20"/>
+                <w:szCs w:val="20"/>
+              </w:rPr>
+              <w:t>uu</w:t>
+            </w:r>
+            <w:r>
+              <w:rPr>
+                <w:sz w:val="20"/>
+                <w:szCs w:val="20"/>
+              </w:rPr>
+              <w:t>id</w:t>
+            </w:r>
+            <w:proofErr w:type="spellEnd"/>
+            <w:r>
+              <w:rPr>
+                <w:sz w:val="20"/>
+                <w:szCs w:val="20"/>
+              </w:rPr>
+              <w:t xml:space="preserve"> from IAM service — </w:t>
+            </w:r>
+            <w:proofErr w:type="spellStart"/>
+            <w:r>
+              <w:rPr>
+                <w:sz w:val="20"/>
+                <w:szCs w:val="20"/>
+              </w:rPr>
+              <w:t>uuid</w:t>
+            </w:r>
+            <w:proofErr w:type="spellEnd"/>
+            <w:r>
+              <w:rPr>
+                <w:sz w:val="20"/>
+                <w:szCs w:val="20"/>
+              </w:rPr>
+              <w:t xml:space="preserve"> primary key on the </w:t>
+            </w:r>
+            <w:proofErr w:type="spellStart"/>
+            <w:r>
+              <w:rPr>
+                <w:sz w:val="20"/>
+                <w:szCs w:val="20"/>
+              </w:rPr>
+              <w:t>iam_user</w:t>
+            </w:r>
+            <w:proofErr w:type="spellEnd"/>
+            <w:r>
+              <w:rPr>
+                <w:sz w:val="20"/>
+                <w:szCs w:val="20"/>
+              </w:rPr>
+              <w:t xml:space="preserve"> table</w:t>
             </w:r>
           </w:p>
         </w:tc>
       </w:tr>
       <w:tr>
-        <w:tblPrEx>
-          <w:tblCellMar>
-            <w:top w:w="0" w:type="dxa"/>
-            <w:bottom w:w="0" w:type="dxa"/>
-          </w:tblCellMar>
-        </w:tblPrEx>
         <w:tc>
           <w:tcPr>
             <w:tcW w:w="3120" w:type="dxa"/>
@@ -1027,12 +1133,6 @@
         </w:tc>
       </w:tr>
       <w:tr>
-        <w:tblPrEx>
-          <w:tblCellMar>
-            <w:top w:w="0" w:type="dxa"/>
-            <w:bottom w:w="0" w:type="dxa"/>
-          </w:tblCellMar>
-        </w:tblPrEx>
         <w:tc>
           <w:tcPr>
             <w:tcW w:w="3120" w:type="dxa"/>
@@ -1137,12 +1237,6 @@
         </w:tc>
       </w:tr>
       <w:tr>
-        <w:tblPrEx>
-          <w:tblCellMar>
-            <w:top w:w="0" w:type="dxa"/>
-            <w:bottom w:w="0" w:type="dxa"/>
-          </w:tblCellMar>
-        </w:tblPrEx>
         <w:tc>
           <w:tcPr>
             <w:tcW w:w="3120" w:type="dxa"/>
@@ -1161,6 +1255,7 @@
             </w:tcMar>
           </w:tcPr>
           <w:p>
+            <w:proofErr w:type="spellStart"/>
             <w:r>
               <w:rPr>
                 <w:sz w:val="20"/>
@@ -1168,6 +1263,7 @@
               </w:rPr>
               <w:t>iat</w:t>
             </w:r>
+            <w:proofErr w:type="spellEnd"/>
           </w:p>
         </w:tc>
         <w:tc>
@@ -1226,12 +1322,6 @@
         </w:tc>
       </w:tr>
       <w:tr>
-        <w:tblPrEx>
-          <w:tblCellMar>
-            <w:top w:w="0" w:type="dxa"/>
-            <w:bottom w:w="0" w:type="dxa"/>
-          </w:tblCellMar>
-        </w:tblPrEx>
         <w:tc>
           <w:tcPr>
             <w:tcW w:w="3120" w:type="dxa"/>
@@ -1315,12 +1405,6 @@
         </w:tc>
       </w:tr>
       <w:tr>
-        <w:tblPrEx>
-          <w:tblCellMar>
-            <w:top w:w="0" w:type="dxa"/>
-            <w:bottom w:w="0" w:type="dxa"/>
-          </w:tblCellMar>
-        </w:tblPrEx>
         <w:tc>
           <w:tcPr>
             <w:tcW w:w="3120" w:type="dxa"/>
@@ -1339,6 +1423,7 @@
             </w:tcMar>
           </w:tcPr>
           <w:p>
+            <w:proofErr w:type="spellStart"/>
             <w:r>
               <w:rPr>
                 <w:sz w:val="20"/>
@@ -1346,6 +1431,7 @@
               </w:rPr>
               <w:t>jti</w:t>
             </w:r>
+            <w:proofErr w:type="spellEnd"/>
           </w:p>
         </w:tc>
         <w:tc>
@@ -1407,15 +1493,31 @@
     <w:p/>
     <w:p>
       <w:r>
-        <w:t>Refresh tokens are long-lived (7 days), stored in the IAM database, and exchanged for new access tokens via POST /auth/refresh. On logout, the jti of the active access token is added to a Redis blocklist with a TTL matching the remaining token lifetime.</w:t>
+        <w:t xml:space="preserve">Refresh tokens are long-lived (7 days), stored in the IAM database, and exchanged for new access tokens via POST /auth/refresh. On logout, the </w:t>
+      </w:r>
+      <w:proofErr w:type="spellStart"/>
+      <w:r>
+        <w:t>jti</w:t>
+      </w:r>
+      <w:proofErr w:type="spellEnd"/>
+      <w:r>
+        <w:t xml:space="preserve"> of the active access token is added to a Redis blocklist with a TTL matching the remaining token lifetime.</w:t>
       </w:r>
     </w:p>
+    <w:p/>
+    <w:p/>
+    <w:p/>
+    <w:p/>
+    <w:p/>
+    <w:p/>
+    <w:p/>
     <w:p/>
     <w:p>
       <w:pPr>
         <w:pStyle w:val="Heading1"/>
       </w:pPr>
       <w:r>
+        <w:lastRenderedPageBreak/>
         <w:t>3. IAM Service</w:t>
       </w:r>
     </w:p>
@@ -1433,23 +1535,26 @@
         </w:rPr>
         <w:t xml:space="preserve">Swagger HTML Docs: </w:t>
       </w:r>
+      <w:r>
+        <w:rPr>
+          <w:b/>
+          <w:bCs/>
+        </w:rPr>
+        <w:t>http://localhost/api/iam/admin/docs/</w:t>
+      </w:r>
     </w:p>
     <w:p/>
     <w:p>
       <w:r>
-        <w:t>Owns all identity and access management. No other service reads or writes user data. The User model extends Django AbstractUser, consolidating all identity fields into a single table. Django's default auth_user table is not used —</w:t>
-      </w:r>
-      <w:r>
-        <w:t xml:space="preserve"> </w:t>
-      </w:r>
-      <w:r>
-        <w:t>AUTH_USER_MODEL = 'users.User' in settings.</w:t>
-      </w:r>
-    </w:p>
-    <w:p/>
-    <w:p>
-      <w:r>
-        <w:t>Setting USERNAME_FIELD = 'email' makes email the login credential. The username field inherited from AbstractUser is kept but synced to email on save so Django internals that depend on username continue to work. first_name and last_name are promoted to REQUIRED_FIELDS so registration always captures them.</w:t>
+        <w:t xml:space="preserve">Owns all identity and access management. No other service reads or writes user data. The User model extends Django </w:t>
+      </w:r>
+      <w:proofErr w:type="spellStart"/>
+      <w:r>
+        <w:t>AbstractUser</w:t>
+      </w:r>
+      <w:proofErr w:type="spellEnd"/>
+      <w:r>
+        <w:t>.</w:t>
       </w:r>
     </w:p>
     <w:p/>
@@ -1491,12 +1596,6 @@
         <w:gridCol w:w="2265"/>
       </w:tblGrid>
       <w:tr>
-        <w:tblPrEx>
-          <w:tblCellMar>
-            <w:top w:w="0" w:type="dxa"/>
-            <w:bottom w:w="0" w:type="dxa"/>
-          </w:tblCellMar>
-        </w:tblPrEx>
         <w:trPr>
           <w:tblHeader/>
         </w:trPr>
@@ -1626,12 +1725,6 @@
         </w:tc>
       </w:tr>
       <w:tr>
-        <w:tblPrEx>
-          <w:tblCellMar>
-            <w:top w:w="0" w:type="dxa"/>
-            <w:bottom w:w="0" w:type="dxa"/>
-          </w:tblCellMar>
-        </w:tblPrEx>
         <w:tc>
           <w:tcPr>
             <w:tcW w:w="2227" w:type="dxa"/>
@@ -1763,12 +1856,6 @@
         </w:tc>
       </w:tr>
       <w:tr>
-        <w:tblPrEx>
-          <w:tblCellMar>
-            <w:top w:w="0" w:type="dxa"/>
-            <w:bottom w:w="0" w:type="dxa"/>
-          </w:tblCellMar>
-        </w:tblPrEx>
         <w:tc>
           <w:tcPr>
             <w:tcW w:w="2227" w:type="dxa"/>
@@ -1879,12 +1966,6 @@
         </w:tc>
       </w:tr>
       <w:tr>
-        <w:tblPrEx>
-          <w:tblCellMar>
-            <w:top w:w="0" w:type="dxa"/>
-            <w:bottom w:w="0" w:type="dxa"/>
-          </w:tblCellMar>
-        </w:tblPrEx>
         <w:tc>
           <w:tcPr>
             <w:tcW w:w="2227" w:type="dxa"/>
@@ -1995,12 +2076,6 @@
         </w:tc>
       </w:tr>
       <w:tr>
-        <w:tblPrEx>
-          <w:tblCellMar>
-            <w:top w:w="0" w:type="dxa"/>
-            <w:bottom w:w="0" w:type="dxa"/>
-          </w:tblCellMar>
-        </w:tblPrEx>
         <w:tc>
           <w:tcPr>
             <w:tcW w:w="2227" w:type="dxa"/>
@@ -2051,15 +2126,17 @@
                 <w:sz w:val="20"/>
                 <w:szCs w:val="20"/>
               </w:rPr>
-              <w:t>/auth/refresh</w:t>
-            </w:r>
-            <w:r>
-              <w:rPr>
-                <w:sz w:val="20"/>
-                <w:szCs w:val="20"/>
-              </w:rPr>
-              <w:t>/access_token</w:t>
-            </w:r>
+              <w:t>/auth/refresh/</w:t>
+            </w:r>
+            <w:proofErr w:type="spellStart"/>
+            <w:r>
+              <w:rPr>
+                <w:sz w:val="20"/>
+                <w:szCs w:val="20"/>
+              </w:rPr>
+              <w:t>access_token</w:t>
+            </w:r>
+            <w:proofErr w:type="spellEnd"/>
           </w:p>
         </w:tc>
         <w:tc>
@@ -2118,12 +2195,6 @@
         </w:tc>
       </w:tr>
       <w:tr>
-        <w:tblPrEx>
-          <w:tblCellMar>
-            <w:top w:w="0" w:type="dxa"/>
-            <w:bottom w:w="0" w:type="dxa"/>
-          </w:tblCellMar>
-        </w:tblPrEx>
         <w:tc>
           <w:tcPr>
             <w:tcW w:w="2227" w:type="dxa"/>
@@ -2174,15 +2245,17 @@
                 <w:sz w:val="20"/>
                 <w:szCs w:val="20"/>
               </w:rPr>
-              <w:t>/auth/refresh</w:t>
-            </w:r>
-            <w:r>
-              <w:rPr>
-                <w:sz w:val="20"/>
-                <w:szCs w:val="20"/>
-              </w:rPr>
-              <w:t>/refresh_token</w:t>
-            </w:r>
+              <w:t>/auth/refresh/</w:t>
+            </w:r>
+            <w:proofErr w:type="spellStart"/>
+            <w:r>
+              <w:rPr>
+                <w:sz w:val="20"/>
+                <w:szCs w:val="20"/>
+              </w:rPr>
+              <w:t>refresh_token</w:t>
+            </w:r>
+            <w:proofErr w:type="spellEnd"/>
           </w:p>
         </w:tc>
         <w:tc>
@@ -2241,12 +2314,6 @@
         </w:tc>
       </w:tr>
       <w:tr>
-        <w:tblPrEx>
-          <w:tblCellMar>
-            <w:top w:w="0" w:type="dxa"/>
-            <w:bottom w:w="0" w:type="dxa"/>
-          </w:tblCellMar>
-        </w:tblPrEx>
         <w:tc>
           <w:tcPr>
             <w:tcW w:w="2227" w:type="dxa"/>
@@ -2351,18 +2418,28 @@
                 <w:sz w:val="20"/>
                 <w:szCs w:val="20"/>
               </w:rPr>
-              <w:t>Revoke refresh token, add jti to Redis blocklist</w:t>
+              <w:t xml:space="preserve">Revoke refresh token, add </w:t>
+            </w:r>
+            <w:proofErr w:type="spellStart"/>
+            <w:r>
+              <w:rPr>
+                <w:sz w:val="20"/>
+                <w:szCs w:val="20"/>
+              </w:rPr>
+              <w:t>jti</w:t>
+            </w:r>
+            <w:proofErr w:type="spellEnd"/>
+            <w:r>
+              <w:rPr>
+                <w:sz w:val="20"/>
+                <w:szCs w:val="20"/>
+              </w:rPr>
+              <w:t xml:space="preserve"> to Redis blocklist</w:t>
             </w:r>
           </w:p>
         </w:tc>
       </w:tr>
       <w:tr>
-        <w:tblPrEx>
-          <w:tblCellMar>
-            <w:top w:w="0" w:type="dxa"/>
-            <w:bottom w:w="0" w:type="dxa"/>
-          </w:tblCellMar>
-        </w:tblPrEx>
         <w:tc>
           <w:tcPr>
             <w:tcW w:w="2227" w:type="dxa"/>
@@ -2473,12 +2550,6 @@
         </w:tc>
       </w:tr>
       <w:tr>
-        <w:tblPrEx>
-          <w:tblCellMar>
-            <w:top w:w="0" w:type="dxa"/>
-            <w:bottom w:w="0" w:type="dxa"/>
-          </w:tblCellMar>
-        </w:tblPrEx>
         <w:tc>
           <w:tcPr>
             <w:tcW w:w="2227" w:type="dxa"/>
@@ -2583,18 +2654,37 @@
                 <w:sz w:val="20"/>
                 <w:szCs w:val="20"/>
               </w:rPr>
-              <w:t>Update first_name, last_name</w:t>
-            </w:r>
+              <w:t xml:space="preserve">Update </w:t>
+            </w:r>
+            <w:proofErr w:type="spellStart"/>
+            <w:r>
+              <w:rPr>
+                <w:sz w:val="20"/>
+                <w:szCs w:val="20"/>
+              </w:rPr>
+              <w:t>first_name</w:t>
+            </w:r>
+            <w:proofErr w:type="spellEnd"/>
+            <w:r>
+              <w:rPr>
+                <w:sz w:val="20"/>
+                <w:szCs w:val="20"/>
+              </w:rPr>
+              <w:t xml:space="preserve">, </w:t>
+            </w:r>
+            <w:proofErr w:type="spellStart"/>
+            <w:r>
+              <w:rPr>
+                <w:sz w:val="20"/>
+                <w:szCs w:val="20"/>
+              </w:rPr>
+              <w:t>last_name</w:t>
+            </w:r>
+            <w:proofErr w:type="spellEnd"/>
           </w:p>
         </w:tc>
       </w:tr>
       <w:tr>
-        <w:tblPrEx>
-          <w:tblCellMar>
-            <w:top w:w="0" w:type="dxa"/>
-            <w:bottom w:w="0" w:type="dxa"/>
-          </w:tblCellMar>
-        </w:tblPrEx>
         <w:tc>
           <w:tcPr>
             <w:tcW w:w="2227" w:type="dxa"/>
@@ -2705,12 +2795,25 @@
         </w:tc>
       </w:tr>
     </w:tbl>
+    <w:p/>
+    <w:p/>
+    <w:p/>
+    <w:p/>
+    <w:p/>
+    <w:p/>
+    <w:p/>
+    <w:p/>
+    <w:p/>
+    <w:p/>
+    <w:p/>
+    <w:p/>
     <w:p/>
     <w:p>
       <w:pPr>
         <w:pStyle w:val="Heading1"/>
       </w:pPr>
       <w:r>
+        <w:lastRenderedPageBreak/>
         <w:t>4. Location Service</w:t>
       </w:r>
     </w:p>
@@ -2775,12 +2878,6 @@
         <w:gridCol w:w="2340"/>
       </w:tblGrid>
       <w:tr>
-        <w:tblPrEx>
-          <w:tblCellMar>
-            <w:top w:w="0" w:type="dxa"/>
-            <w:bottom w:w="0" w:type="dxa"/>
-          </w:tblCellMar>
-        </w:tblPrEx>
         <w:trPr>
           <w:tblHeader/>
         </w:trPr>
@@ -2910,12 +3007,6 @@
         </w:tc>
       </w:tr>
       <w:tr>
-        <w:tblPrEx>
-          <w:tblCellMar>
-            <w:top w:w="0" w:type="dxa"/>
-            <w:bottom w:w="0" w:type="dxa"/>
-          </w:tblCellMar>
-        </w:tblPrEx>
         <w:tc>
           <w:tcPr>
             <w:tcW w:w="2340" w:type="dxa"/>
@@ -2966,8 +3057,17 @@
                 <w:sz w:val="20"/>
                 <w:szCs w:val="20"/>
               </w:rPr>
-              <w:t>/countries</w:t>
-            </w:r>
+              <w:t>/</w:t>
+            </w:r>
+            <w:proofErr w:type="gramStart"/>
+            <w:r>
+              <w:rPr>
+                <w:sz w:val="20"/>
+                <w:szCs w:val="20"/>
+              </w:rPr>
+              <w:t>countries</w:t>
+            </w:r>
+            <w:proofErr w:type="gramEnd"/>
           </w:p>
         </w:tc>
         <w:tc>
@@ -3026,12 +3126,6 @@
         </w:tc>
       </w:tr>
       <w:tr>
-        <w:tblPrEx>
-          <w:tblCellMar>
-            <w:top w:w="0" w:type="dxa"/>
-            <w:bottom w:w="0" w:type="dxa"/>
-          </w:tblCellMar>
-        </w:tblPrEx>
         <w:tc>
           <w:tcPr>
             <w:tcW w:w="2340" w:type="dxa"/>
@@ -3055,7 +3149,6 @@
                 <w:sz w:val="20"/>
                 <w:szCs w:val="20"/>
               </w:rPr>
-              <w:lastRenderedPageBreak/>
               <w:t>GET</w:t>
             </w:r>
           </w:p>
@@ -3143,12 +3236,6 @@
         </w:tc>
       </w:tr>
       <w:tr>
-        <w:tblPrEx>
-          <w:tblCellMar>
-            <w:top w:w="0" w:type="dxa"/>
-            <w:bottom w:w="0" w:type="dxa"/>
-          </w:tblCellMar>
-        </w:tblPrEx>
         <w:tc>
           <w:tcPr>
             <w:tcW w:w="2340" w:type="dxa"/>
@@ -3259,12 +3346,6 @@
         </w:tc>
       </w:tr>
       <w:tr>
-        <w:tblPrEx>
-          <w:tblCellMar>
-            <w:top w:w="0" w:type="dxa"/>
-            <w:bottom w:w="0" w:type="dxa"/>
-          </w:tblCellMar>
-        </w:tblPrEx>
         <w:tc>
           <w:tcPr>
             <w:tcW w:w="2340" w:type="dxa"/>
@@ -3375,12 +3456,6 @@
         </w:tc>
       </w:tr>
       <w:tr>
-        <w:tblPrEx>
-          <w:tblCellMar>
-            <w:top w:w="0" w:type="dxa"/>
-            <w:bottom w:w="0" w:type="dxa"/>
-          </w:tblCellMar>
-        </w:tblPrEx>
         <w:tc>
           <w:tcPr>
             <w:tcW w:w="2340" w:type="dxa"/>
@@ -3498,12 +3573,40 @@
         </w:tc>
       </w:tr>
     </w:tbl>
+    <w:p/>
+    <w:p/>
+    <w:p/>
+    <w:p/>
+    <w:p/>
+    <w:p/>
+    <w:p/>
+    <w:p/>
+    <w:p/>
+    <w:p/>
+    <w:p/>
+    <w:p/>
+    <w:p/>
+    <w:p/>
+    <w:p/>
+    <w:p/>
+    <w:p/>
+    <w:p/>
+    <w:p/>
+    <w:p/>
+    <w:p/>
+    <w:p/>
+    <w:p/>
+    <w:p/>
+    <w:p/>
+    <w:p/>
+    <w:p/>
     <w:p/>
     <w:p>
       <w:pPr>
         <w:pStyle w:val="Heading1"/>
       </w:pPr>
       <w:r>
+        <w:lastRenderedPageBreak/>
         <w:t>5. Catalog Service</w:t>
       </w:r>
     </w:p>
@@ -3525,7 +3628,15 @@
     <w:p/>
     <w:p>
       <w:r>
-        <w:t>Manages the content catalogue (movies, genres), scheduling (showtimes), and physical venue layout (rooms, rows, seats). Also owns TicketType pricing, which is scoped per country using an ISO country code string — not a foreign key to the Location service.</w:t>
+        <w:t xml:space="preserve">Manages the content catalogue (movies, genres), scheduling (showtimes), and physical venue layout (rooms, rows, seats). Also owns </w:t>
+      </w:r>
+      <w:proofErr w:type="spellStart"/>
+      <w:r>
+        <w:t>TicketType</w:t>
+      </w:r>
+      <w:proofErr w:type="spellEnd"/>
+      <w:r>
+        <w:t xml:space="preserve"> pricing, which is scoped per country using an ISO country code string — not a foreign key to the Location service.</w:t>
       </w:r>
     </w:p>
     <w:p/>
@@ -3567,12 +3678,6 @@
         <w:gridCol w:w="2249"/>
       </w:tblGrid>
       <w:tr>
-        <w:tblPrEx>
-          <w:tblCellMar>
-            <w:top w:w="0" w:type="dxa"/>
-            <w:bottom w:w="0" w:type="dxa"/>
-          </w:tblCellMar>
-        </w:tblPrEx>
         <w:trPr>
           <w:tblHeader/>
         </w:trPr>
@@ -3702,12 +3807,6 @@
         </w:tc>
       </w:tr>
       <w:tr>
-        <w:tblPrEx>
-          <w:tblCellMar>
-            <w:top w:w="0" w:type="dxa"/>
-            <w:bottom w:w="0" w:type="dxa"/>
-          </w:tblCellMar>
-        </w:tblPrEx>
         <w:tc>
           <w:tcPr>
             <w:tcW w:w="1906" w:type="dxa"/>
@@ -3758,8 +3857,17 @@
                 <w:sz w:val="20"/>
                 <w:szCs w:val="20"/>
               </w:rPr>
-              <w:t>/movies</w:t>
-            </w:r>
+              <w:t>/</w:t>
+            </w:r>
+            <w:proofErr w:type="gramStart"/>
+            <w:r>
+              <w:rPr>
+                <w:sz w:val="20"/>
+                <w:szCs w:val="20"/>
+              </w:rPr>
+              <w:t>movies</w:t>
+            </w:r>
+            <w:proofErr w:type="gramEnd"/>
           </w:p>
         </w:tc>
         <w:tc>
@@ -3818,12 +3926,6 @@
         </w:tc>
       </w:tr>
       <w:tr>
-        <w:tblPrEx>
-          <w:tblCellMar>
-            <w:top w:w="0" w:type="dxa"/>
-            <w:bottom w:w="0" w:type="dxa"/>
-          </w:tblCellMar>
-        </w:tblPrEx>
         <w:tc>
           <w:tcPr>
             <w:tcW w:w="1906" w:type="dxa"/>
@@ -3934,12 +4036,6 @@
         </w:tc>
       </w:tr>
       <w:tr>
-        <w:tblPrEx>
-          <w:tblCellMar>
-            <w:top w:w="0" w:type="dxa"/>
-            <w:bottom w:w="0" w:type="dxa"/>
-          </w:tblCellMar>
-        </w:tblPrEx>
         <w:tc>
           <w:tcPr>
             <w:tcW w:w="1906" w:type="dxa"/>
@@ -3990,15 +4086,24 @@
                 <w:sz w:val="20"/>
                 <w:szCs w:val="20"/>
               </w:rPr>
-              <w:t>/showtimes</w:t>
-            </w:r>
-            <w:r>
-              <w:rPr>
-                <w:sz w:val="20"/>
-                <w:szCs w:val="20"/>
-              </w:rPr>
               <w:t>/</w:t>
             </w:r>
+            <w:proofErr w:type="gramStart"/>
+            <w:r>
+              <w:rPr>
+                <w:sz w:val="20"/>
+                <w:szCs w:val="20"/>
+              </w:rPr>
+              <w:t>showtimes</w:t>
+            </w:r>
+            <w:proofErr w:type="gramEnd"/>
+            <w:r>
+              <w:rPr>
+                <w:sz w:val="20"/>
+                <w:szCs w:val="20"/>
+              </w:rPr>
+              <w:t>/</w:t>
+            </w:r>
             <w:r>
               <w:rPr>
                 <w:sz w:val="20"/>
@@ -4013,6 +4118,7 @@
               </w:rPr>
               <w:t>{</w:t>
             </w:r>
+            <w:proofErr w:type="spellStart"/>
             <w:r>
               <w:rPr>
                 <w:sz w:val="20"/>
@@ -4020,6 +4126,7 @@
               </w:rPr>
               <w:t>cinema_id</w:t>
             </w:r>
+            <w:proofErr w:type="spellEnd"/>
             <w:r>
               <w:rPr>
                 <w:sz w:val="20"/>
@@ -4092,12 +4199,6 @@
         </w:tc>
       </w:tr>
       <w:tr>
-        <w:tblPrEx>
-          <w:tblCellMar>
-            <w:top w:w="0" w:type="dxa"/>
-            <w:bottom w:w="0" w:type="dxa"/>
-          </w:tblCellMar>
-        </w:tblPrEx>
         <w:tc>
           <w:tcPr>
             <w:tcW w:w="1906" w:type="dxa"/>
@@ -4215,12 +4316,6 @@
         </w:tc>
       </w:tr>
       <w:tr>
-        <w:tblPrEx>
-          <w:tblCellMar>
-            <w:top w:w="0" w:type="dxa"/>
-            <w:bottom w:w="0" w:type="dxa"/>
-          </w:tblCellMar>
-        </w:tblPrEx>
         <w:tc>
           <w:tcPr>
             <w:tcW w:w="1906" w:type="dxa"/>
@@ -4332,18 +4427,28 @@
                 <w:sz w:val="20"/>
                 <w:szCs w:val="20"/>
               </w:rPr>
-              <w:t xml:space="preserve"> (returned with ticket_types for every seat)</w:t>
+              <w:t xml:space="preserve"> (returned with </w:t>
+            </w:r>
+            <w:proofErr w:type="spellStart"/>
+            <w:r>
+              <w:rPr>
+                <w:sz w:val="20"/>
+                <w:szCs w:val="20"/>
+              </w:rPr>
+              <w:t>ticket_types</w:t>
+            </w:r>
+            <w:proofErr w:type="spellEnd"/>
+            <w:r>
+              <w:rPr>
+                <w:sz w:val="20"/>
+                <w:szCs w:val="20"/>
+              </w:rPr>
+              <w:t xml:space="preserve"> for every seat)</w:t>
             </w:r>
           </w:p>
         </w:tc>
       </w:tr>
       <w:tr>
-        <w:tblPrEx>
-          <w:tblCellMar>
-            <w:top w:w="0" w:type="dxa"/>
-            <w:bottom w:w="0" w:type="dxa"/>
-          </w:tblCellMar>
-        </w:tblPrEx>
         <w:tc>
           <w:tcPr>
             <w:tcW w:w="1906" w:type="dxa"/>
@@ -4454,12 +4559,6 @@
         </w:tc>
       </w:tr>
       <w:tr>
-        <w:tblPrEx>
-          <w:tblCellMar>
-            <w:top w:w="0" w:type="dxa"/>
-            <w:bottom w:w="0" w:type="dxa"/>
-          </w:tblCellMar>
-        </w:tblPrEx>
         <w:tc>
           <w:tcPr>
             <w:tcW w:w="1906" w:type="dxa"/>
@@ -4538,12 +4637,30 @@
         </w:tc>
       </w:tr>
     </w:tbl>
+    <w:p/>
+    <w:p/>
+    <w:p/>
+    <w:p/>
+    <w:p/>
+    <w:p/>
+    <w:p/>
+    <w:p/>
+    <w:p/>
+    <w:p/>
+    <w:p/>
+    <w:p/>
+    <w:p/>
+    <w:p/>
+    <w:p/>
+    <w:p/>
+    <w:p/>
     <w:p/>
     <w:p>
       <w:pPr>
         <w:pStyle w:val="Heading1"/>
       </w:pPr>
       <w:r>
+        <w:lastRenderedPageBreak/>
         <w:t>6. Reservation Service</w:t>
       </w:r>
     </w:p>
@@ -4561,14 +4678,26 @@
     <w:p/>
     <w:p>
       <w:r>
-        <w:lastRenderedPageBreak/>
         <w:t xml:space="preserve">This service stores </w:t>
       </w:r>
+      <w:proofErr w:type="spellStart"/>
       <w:r>
         <w:t>user</w:t>
       </w:r>
       <w:r>
-        <w:t>_id and showtime_id as opaque references. It calls Catalog synchronously to fetch seat availability and Stripe for payment. It never calls IAM — user identity comes from the JWT claims decoded by the API Gateway.</w:t>
+        <w:t>_id</w:t>
+      </w:r>
+      <w:proofErr w:type="spellEnd"/>
+      <w:r>
+        <w:t xml:space="preserve"> and </w:t>
+      </w:r>
+      <w:proofErr w:type="spellStart"/>
+      <w:r>
+        <w:t>showtime_id</w:t>
+      </w:r>
+      <w:proofErr w:type="spellEnd"/>
+      <w:r>
+        <w:t xml:space="preserve"> as opaque references. It calls Catalog synchronously to fetch seat availability and Stripe for payment. It never calls IAM — user identity comes from the JWT claims decoded by the API Gateway.</w:t>
       </w:r>
     </w:p>
     <w:p/>
@@ -4594,8 +4723,44 @@
         </w:numPr>
       </w:pPr>
       <w:r>
-        <w:t>Hold key format: seat_hold:{showtime_id}:{seat_id} — value: reservation_id</w:t>
-      </w:r>
+        <w:t xml:space="preserve">Hold key format: </w:t>
+      </w:r>
+      <w:proofErr w:type="spellStart"/>
+      <w:r>
+        <w:t>seat_</w:t>
+      </w:r>
+      <w:proofErr w:type="gramStart"/>
+      <w:r>
+        <w:t>hold</w:t>
+      </w:r>
+      <w:proofErr w:type="spellEnd"/>
+      <w:r>
+        <w:t>:{</w:t>
+      </w:r>
+      <w:proofErr w:type="spellStart"/>
+      <w:proofErr w:type="gramEnd"/>
+      <w:r>
+        <w:t>showtime_id</w:t>
+      </w:r>
+      <w:proofErr w:type="spellEnd"/>
+      <w:proofErr w:type="gramStart"/>
+      <w:r>
+        <w:t>}:{</w:t>
+      </w:r>
+      <w:proofErr w:type="spellStart"/>
+      <w:proofErr w:type="gramEnd"/>
+      <w:r>
+        <w:t>seat_id</w:t>
+      </w:r>
+      <w:proofErr w:type="spellEnd"/>
+      <w:r>
+        <w:t xml:space="preserve">} — value: </w:t>
+      </w:r>
+      <w:proofErr w:type="spellStart"/>
+      <w:r>
+        <w:t>reservation_id</w:t>
+      </w:r>
+      <w:proofErr w:type="spellEnd"/>
     </w:p>
     <w:p>
       <w:pPr>
@@ -4662,8 +4827,13 @@
         </w:numPr>
       </w:pPr>
       <w:r>
-        <w:t>Create Reservation record with status=in_progress</w:t>
-      </w:r>
+        <w:t>Create Reservation record with status=</w:t>
+      </w:r>
+      <w:proofErr w:type="spellStart"/>
+      <w:r>
+        <w:t>in_progress</w:t>
+      </w:r>
+      <w:proofErr w:type="spellEnd"/>
     </w:p>
     <w:p>
       <w:pPr>
@@ -4674,7 +4844,23 @@
         </w:numPr>
       </w:pPr>
       <w:r>
-        <w:t>Create Stripe PaymentIntent, return client_secret to frontend</w:t>
+        <w:t xml:space="preserve">Create Stripe </w:t>
+      </w:r>
+      <w:proofErr w:type="spellStart"/>
+      <w:r>
+        <w:t>PaymentIntent</w:t>
+      </w:r>
+      <w:proofErr w:type="spellEnd"/>
+      <w:r>
+        <w:t xml:space="preserve">, return </w:t>
+      </w:r>
+      <w:proofErr w:type="spellStart"/>
+      <w:r>
+        <w:t>client_secret</w:t>
+      </w:r>
+      <w:proofErr w:type="spellEnd"/>
+      <w:r>
+        <w:t xml:space="preserve"> to frontend</w:t>
       </w:r>
     </w:p>
     <w:p>
@@ -4686,7 +4872,28 @@
         </w:numPr>
       </w:pPr>
       <w:r>
-        <w:t>On Stripe webhook payment_intent.succeeded: update payment_status=paid, status=confirmed</w:t>
+        <w:t xml:space="preserve">On Stripe webhook </w:t>
+      </w:r>
+      <w:proofErr w:type="spellStart"/>
+      <w:r>
+        <w:t>payment_</w:t>
+      </w:r>
+      <w:proofErr w:type="gramStart"/>
+      <w:r>
+        <w:t>intent.succeeded</w:t>
+      </w:r>
+      <w:proofErr w:type="spellEnd"/>
+      <w:proofErr w:type="gramEnd"/>
+      <w:r>
+        <w:t xml:space="preserve">: update </w:t>
+      </w:r>
+      <w:proofErr w:type="spellStart"/>
+      <w:r>
+        <w:t>payment_status</w:t>
+      </w:r>
+      <w:proofErr w:type="spellEnd"/>
+      <w:r>
+        <w:t>=paid, status=confirmed</w:t>
       </w:r>
     </w:p>
     <w:p>
@@ -4698,7 +4905,23 @@
         </w:numPr>
       </w:pPr>
       <w:r>
-        <w:t>Generate ReservationTicket rows (one per seat), each with uuid + random secret</w:t>
+        <w:t xml:space="preserve">Generate </w:t>
+      </w:r>
+      <w:proofErr w:type="spellStart"/>
+      <w:r>
+        <w:t>ReservationTicket</w:t>
+      </w:r>
+      <w:proofErr w:type="spellEnd"/>
+      <w:r>
+        <w:t xml:space="preserve"> rows (one per seat), each with </w:t>
+      </w:r>
+      <w:proofErr w:type="spellStart"/>
+      <w:r>
+        <w:t>uuid</w:t>
+      </w:r>
+      <w:proofErr w:type="spellEnd"/>
+      <w:r>
+        <w:t xml:space="preserve"> + random secret</w:t>
       </w:r>
     </w:p>
     <w:p>
@@ -4710,7 +4933,36 @@
         </w:numPr>
       </w:pPr>
       <w:r>
-        <w:t>Generate QR code per ticket: encode { uuid, secret, showtime_id } as JSON</w:t>
+        <w:t xml:space="preserve">Generate QR code per ticket: encode </w:t>
+      </w:r>
+      <w:proofErr w:type="gramStart"/>
+      <w:r>
+        <w:t xml:space="preserve">{ </w:t>
+      </w:r>
+      <w:proofErr w:type="spellStart"/>
+      <w:r>
+        <w:t>uuid</w:t>
+      </w:r>
+      <w:proofErr w:type="spellEnd"/>
+      <w:proofErr w:type="gramEnd"/>
+      <w:r>
+        <w:t xml:space="preserve">, secret, </w:t>
+      </w:r>
+      <w:proofErr w:type="spellStart"/>
+      <w:r>
+        <w:t>showtime_</w:t>
+      </w:r>
+      <w:proofErr w:type="gramStart"/>
+      <w:r>
+        <w:t>id</w:t>
+      </w:r>
+      <w:proofErr w:type="spellEnd"/>
+      <w:r>
+        <w:t xml:space="preserve"> }</w:t>
+      </w:r>
+      <w:proofErr w:type="gramEnd"/>
+      <w:r>
+        <w:t xml:space="preserve"> as JSON</w:t>
       </w:r>
     </w:p>
     <w:p>
@@ -4734,8 +4986,21 @@
         </w:numPr>
       </w:pPr>
       <w:r>
-        <w:t>Upload PDFs to object storage (S3 / MinIO), store path in pdf_path</w:t>
-      </w:r>
+        <w:t xml:space="preserve">Upload PDFs to object storage (S3 / </w:t>
+      </w:r>
+      <w:proofErr w:type="spellStart"/>
+      <w:r>
+        <w:t>MinIO</w:t>
+      </w:r>
+      <w:proofErr w:type="spellEnd"/>
+      <w:r>
+        <w:t xml:space="preserve">), store path in </w:t>
+      </w:r>
+      <w:proofErr w:type="spellStart"/>
+      <w:r>
+        <w:t>pdf_path</w:t>
+      </w:r>
+      <w:proofErr w:type="spellEnd"/>
     </w:p>
     <w:p>
       <w:pPr>
@@ -4746,8 +5011,15 @@
         </w:numPr>
       </w:pPr>
       <w:r>
-        <w:t>Send confirmation email with PDF attachments to reservation.email</w:t>
-      </w:r>
+        <w:t xml:space="preserve">Send confirmation email with PDF attachments to </w:t>
+      </w:r>
+      <w:proofErr w:type="spellStart"/>
+      <w:proofErr w:type="gramStart"/>
+      <w:r>
+        <w:t>reservation.email</w:t>
+      </w:r>
+      <w:proofErr w:type="spellEnd"/>
+      <w:proofErr w:type="gramEnd"/>
     </w:p>
     <w:p/>
     <w:p>
@@ -4766,7 +5038,39 @@
     </w:p>
     <w:p>
       <w:r>
-        <w:t>Door scanners call POST /tickets/validate with the QR payload. The service looks up the ticket by uuid, verifies the secret matches, and checks scanned_at is null. If valid, it sets scanned_at = now() and returns 200. A grace window of 30 seconds prevents rejection on double-scans.</w:t>
+        <w:t xml:space="preserve">Door scanners call POST /tickets/validate with the QR payload. The service looks up the ticket by </w:t>
+      </w:r>
+      <w:proofErr w:type="spellStart"/>
+      <w:r>
+        <w:t>uuid</w:t>
+      </w:r>
+      <w:proofErr w:type="spellEnd"/>
+      <w:r>
+        <w:t xml:space="preserve">, verifies the secret matches, and checks </w:t>
+      </w:r>
+      <w:proofErr w:type="spellStart"/>
+      <w:r>
+        <w:t>scanned_at</w:t>
+      </w:r>
+      <w:proofErr w:type="spellEnd"/>
+      <w:r>
+        <w:t xml:space="preserve"> is null. If valid, it sets </w:t>
+      </w:r>
+      <w:proofErr w:type="spellStart"/>
+      <w:r>
+        <w:t>scanned_at</w:t>
+      </w:r>
+      <w:proofErr w:type="spellEnd"/>
+      <w:r>
+        <w:t xml:space="preserve"> = </w:t>
+      </w:r>
+      <w:proofErr w:type="gramStart"/>
+      <w:r>
+        <w:t>now(</w:t>
+      </w:r>
+      <w:proofErr w:type="gramEnd"/>
+      <w:r>
+        <w:t>) and returns 200. A grace window of 30 seconds prevents rejection on double-scans.</w:t>
       </w:r>
     </w:p>
     <w:p/>
@@ -4808,12 +5112,6 @@
         <w:gridCol w:w="2631"/>
       </w:tblGrid>
       <w:tr>
-        <w:tblPrEx>
-          <w:tblCellMar>
-            <w:top w:w="0" w:type="dxa"/>
-            <w:bottom w:w="0" w:type="dxa"/>
-          </w:tblCellMar>
-        </w:tblPrEx>
         <w:trPr>
           <w:tblHeader/>
         </w:trPr>
@@ -4943,12 +5241,6 @@
         </w:tc>
       </w:tr>
       <w:tr>
-        <w:tblPrEx>
-          <w:tblCellMar>
-            <w:top w:w="0" w:type="dxa"/>
-            <w:bottom w:w="0" w:type="dxa"/>
-          </w:tblCellMar>
-        </w:tblPrEx>
         <w:tc>
           <w:tcPr>
             <w:tcW w:w="2135" w:type="dxa"/>
@@ -4999,8 +5291,17 @@
                 <w:sz w:val="20"/>
                 <w:szCs w:val="20"/>
               </w:rPr>
-              <w:t>/reservation</w:t>
-            </w:r>
+              <w:t>/</w:t>
+            </w:r>
+            <w:proofErr w:type="gramStart"/>
+            <w:r>
+              <w:rPr>
+                <w:sz w:val="20"/>
+                <w:szCs w:val="20"/>
+              </w:rPr>
+              <w:t>reservation</w:t>
+            </w:r>
+            <w:proofErr w:type="gramEnd"/>
           </w:p>
         </w:tc>
         <w:tc>
@@ -5059,12 +5360,6 @@
         </w:tc>
       </w:tr>
       <w:tr>
-        <w:tblPrEx>
-          <w:tblCellMar>
-            <w:top w:w="0" w:type="dxa"/>
-            <w:bottom w:w="0" w:type="dxa"/>
-          </w:tblCellMar>
-        </w:tblPrEx>
         <w:tc>
           <w:tcPr>
             <w:tcW w:w="2135" w:type="dxa"/>
@@ -5175,12 +5470,6 @@
         </w:tc>
       </w:tr>
       <w:tr>
-        <w:tblPrEx>
-          <w:tblCellMar>
-            <w:top w:w="0" w:type="dxa"/>
-            <w:bottom w:w="0" w:type="dxa"/>
-          </w:tblCellMar>
-        </w:tblPrEx>
         <w:tc>
           <w:tcPr>
             <w:tcW w:w="2135" w:type="dxa"/>
@@ -5204,6 +5493,7 @@
                 <w:sz w:val="20"/>
                 <w:szCs w:val="20"/>
               </w:rPr>
+              <w:lastRenderedPageBreak/>
               <w:t>DELETE</w:t>
             </w:r>
           </w:p>
@@ -5291,12 +5581,6 @@
         </w:tc>
       </w:tr>
       <w:tr>
-        <w:tblPrEx>
-          <w:tblCellMar>
-            <w:top w:w="0" w:type="dxa"/>
-            <w:bottom w:w="0" w:type="dxa"/>
-          </w:tblCellMar>
-        </w:tblPrEx>
         <w:tc>
           <w:tcPr>
             <w:tcW w:w="2135" w:type="dxa"/>
@@ -5401,18 +5685,21 @@
                 <w:sz w:val="20"/>
                 <w:szCs w:val="20"/>
               </w:rPr>
-              <w:t>Create Stripe PaymentIntent</w:t>
-            </w:r>
+              <w:t xml:space="preserve">Create Stripe </w:t>
+            </w:r>
+            <w:proofErr w:type="spellStart"/>
+            <w:r>
+              <w:rPr>
+                <w:sz w:val="20"/>
+                <w:szCs w:val="20"/>
+              </w:rPr>
+              <w:t>PaymentIntent</w:t>
+            </w:r>
+            <w:proofErr w:type="spellEnd"/>
           </w:p>
         </w:tc>
       </w:tr>
       <w:tr>
-        <w:tblPrEx>
-          <w:tblCellMar>
-            <w:top w:w="0" w:type="dxa"/>
-            <w:bottom w:w="0" w:type="dxa"/>
-          </w:tblCellMar>
-        </w:tblPrEx>
         <w:tc>
           <w:tcPr>
             <w:tcW w:w="2135" w:type="dxa"/>
@@ -5436,7 +5723,6 @@
                 <w:sz w:val="20"/>
                 <w:szCs w:val="20"/>
               </w:rPr>
-              <w:lastRenderedPageBreak/>
               <w:t>POST</w:t>
             </w:r>
           </w:p>
@@ -5518,18 +5804,37 @@
                 <w:sz w:val="20"/>
                 <w:szCs w:val="20"/>
               </w:rPr>
-              <w:t>Handle payment_intent.succeeded etc.</w:t>
+              <w:t xml:space="preserve">Handle </w:t>
+            </w:r>
+            <w:proofErr w:type="spellStart"/>
+            <w:r>
+              <w:rPr>
+                <w:sz w:val="20"/>
+                <w:szCs w:val="20"/>
+              </w:rPr>
+              <w:t>payment_</w:t>
+            </w:r>
+            <w:proofErr w:type="gramStart"/>
+            <w:r>
+              <w:rPr>
+                <w:sz w:val="20"/>
+                <w:szCs w:val="20"/>
+              </w:rPr>
+              <w:t>intent.succeeded</w:t>
+            </w:r>
+            <w:proofErr w:type="spellEnd"/>
+            <w:proofErr w:type="gramEnd"/>
+            <w:r>
+              <w:rPr>
+                <w:sz w:val="20"/>
+                <w:szCs w:val="20"/>
+              </w:rPr>
+              <w:t xml:space="preserve"> etc.</w:t>
             </w:r>
           </w:p>
         </w:tc>
       </w:tr>
       <w:tr>
-        <w:tblPrEx>
-          <w:tblCellMar>
-            <w:top w:w="0" w:type="dxa"/>
-            <w:bottom w:w="0" w:type="dxa"/>
-          </w:tblCellMar>
-        </w:tblPrEx>
         <w:tc>
           <w:tcPr>
             <w:tcW w:w="2135" w:type="dxa"/>
@@ -5580,7 +5885,23 @@
                 <w:sz w:val="20"/>
                 <w:szCs w:val="20"/>
               </w:rPr>
-              <w:t>/ticket/{uuid}</w:t>
+              <w:t>/ticket/{</w:t>
+            </w:r>
+            <w:proofErr w:type="spellStart"/>
+            <w:r>
+              <w:rPr>
+                <w:sz w:val="20"/>
+                <w:szCs w:val="20"/>
+              </w:rPr>
+              <w:t>uuid</w:t>
+            </w:r>
+            <w:proofErr w:type="spellEnd"/>
+            <w:r>
+              <w:rPr>
+                <w:sz w:val="20"/>
+                <w:szCs w:val="20"/>
+              </w:rPr>
+              <w:t>}</w:t>
             </w:r>
           </w:p>
         </w:tc>
@@ -5640,12 +5961,6 @@
         </w:tc>
       </w:tr>
       <w:tr>
-        <w:tblPrEx>
-          <w:tblCellMar>
-            <w:top w:w="0" w:type="dxa"/>
-            <w:bottom w:w="0" w:type="dxa"/>
-          </w:tblCellMar>
-        </w:tblPrEx>
         <w:tc>
           <w:tcPr>
             <w:tcW w:w="2135" w:type="dxa"/>
@@ -5779,12 +6094,44 @@
         </w:tc>
       </w:tr>
     </w:tbl>
+    <w:p/>
+    <w:p/>
+    <w:p/>
+    <w:p/>
+    <w:p/>
+    <w:p/>
+    <w:p/>
+    <w:p/>
+    <w:p/>
+    <w:p/>
+    <w:p/>
+    <w:p/>
+    <w:p/>
+    <w:p/>
+    <w:p/>
+    <w:p/>
+    <w:p/>
+    <w:p/>
+    <w:p/>
+    <w:p/>
+    <w:p/>
+    <w:p/>
+    <w:p/>
+    <w:p/>
+    <w:p/>
+    <w:p/>
+    <w:p/>
+    <w:p/>
+    <w:p/>
+    <w:p/>
+    <w:p/>
     <w:p/>
     <w:p>
       <w:pPr>
         <w:pStyle w:val="Heading1"/>
       </w:pPr>
       <w:r>
+        <w:lastRenderedPageBreak/>
         <w:t>7. Deployment Notes</w:t>
       </w:r>
     </w:p>
@@ -5820,12 +6167,6 @@
         <w:gridCol w:w="2340"/>
       </w:tblGrid>
       <w:tr>
-        <w:tblPrEx>
-          <w:tblCellMar>
-            <w:top w:w="0" w:type="dxa"/>
-            <w:bottom w:w="0" w:type="dxa"/>
-          </w:tblCellMar>
-        </w:tblPrEx>
         <w:trPr>
           <w:tblHeader/>
         </w:trPr>
@@ -5955,12 +6296,6 @@
         </w:tc>
       </w:tr>
       <w:tr>
-        <w:tblPrEx>
-          <w:tblCellMar>
-            <w:top w:w="0" w:type="dxa"/>
-            <w:bottom w:w="0" w:type="dxa"/>
-          </w:tblCellMar>
-        </w:tblPrEx>
         <w:tc>
           <w:tcPr>
             <w:tcW w:w="2340" w:type="dxa"/>
@@ -6071,12 +6406,6 @@
         </w:tc>
       </w:tr>
       <w:tr>
-        <w:tblPrEx>
-          <w:tblCellMar>
-            <w:top w:w="0" w:type="dxa"/>
-            <w:bottom w:w="0" w:type="dxa"/>
-          </w:tblCellMar>
-        </w:tblPrEx>
         <w:tc>
           <w:tcPr>
             <w:tcW w:w="2340" w:type="dxa"/>
@@ -6122,6 +6451,7 @@
             </w:tcMar>
           </w:tcPr>
           <w:p>
+            <w:proofErr w:type="spellStart"/>
             <w:r>
               <w:rPr>
                 <w:sz w:val="20"/>
@@ -6129,6 +6459,7 @@
               </w:rPr>
               <w:t>FastAPI</w:t>
             </w:r>
+            <w:proofErr w:type="spellEnd"/>
           </w:p>
         </w:tc>
         <w:tc>
@@ -6187,12 +6518,6 @@
         </w:tc>
       </w:tr>
       <w:tr>
-        <w:tblPrEx>
-          <w:tblCellMar>
-            <w:top w:w="0" w:type="dxa"/>
-            <w:bottom w:w="0" w:type="dxa"/>
-          </w:tblCellMar>
-        </w:tblPrEx>
         <w:tc>
           <w:tcPr>
             <w:tcW w:w="2340" w:type="dxa"/>
@@ -6238,6 +6563,7 @@
             </w:tcMar>
           </w:tcPr>
           <w:p>
+            <w:proofErr w:type="spellStart"/>
             <w:r>
               <w:rPr>
                 <w:sz w:val="20"/>
@@ -6245,6 +6571,7 @@
               </w:rPr>
               <w:t>FastAPI</w:t>
             </w:r>
+            <w:proofErr w:type="spellEnd"/>
           </w:p>
         </w:tc>
         <w:tc>
@@ -6310,12 +6637,6 @@
         </w:tc>
       </w:tr>
       <w:tr>
-        <w:tblPrEx>
-          <w:tblCellMar>
-            <w:top w:w="0" w:type="dxa"/>
-            <w:bottom w:w="0" w:type="dxa"/>
-          </w:tblCellMar>
-        </w:tblPrEx>
         <w:tc>
           <w:tcPr>
             <w:tcW w:w="2340" w:type="dxa"/>
@@ -6361,6 +6682,7 @@
             </w:tcMar>
           </w:tcPr>
           <w:p>
+            <w:proofErr w:type="spellStart"/>
             <w:r>
               <w:rPr>
                 <w:sz w:val="20"/>
@@ -6368,19 +6690,13 @@
               </w:rPr>
               <w:t>FastAPI</w:t>
             </w:r>
-            <w:r>
-              <w:rPr>
-                <w:sz w:val="20"/>
-                <w:szCs w:val="20"/>
-              </w:rPr>
-              <w:t xml:space="preserve"> </w:t>
-            </w:r>
-            <w:r>
-              <w:rPr>
-                <w:sz w:val="20"/>
-                <w:szCs w:val="20"/>
-              </w:rPr>
-              <w:t>+ Celery</w:t>
+            <w:proofErr w:type="spellEnd"/>
+            <w:r>
+              <w:rPr>
+                <w:sz w:val="20"/>
+                <w:szCs w:val="20"/>
+              </w:rPr>
+              <w:t xml:space="preserve"> + Celery</w:t>
             </w:r>
           </w:p>
         </w:tc>
@@ -6463,6 +6779,20 @@
         <w:t xml:space="preserve"> </w:t>
       </w:r>
     </w:p>
+    <w:p/>
+    <w:p/>
+    <w:p/>
+    <w:p/>
+    <w:p/>
+    <w:p/>
+    <w:p/>
+    <w:p/>
+    <w:p/>
+    <w:p/>
+    <w:p/>
+    <w:p/>
+    <w:p/>
+    <w:p/>
     <w:p/>
     <w:p/>
     <w:p/>
@@ -6509,12 +6839,6 @@
         <w:gridCol w:w="2340"/>
       </w:tblGrid>
       <w:tr>
-        <w:tblPrEx>
-          <w:tblCellMar>
-            <w:top w:w="0" w:type="dxa"/>
-            <w:bottom w:w="0" w:type="dxa"/>
-          </w:tblCellMar>
-        </w:tblPrEx>
         <w:trPr>
           <w:tblHeader/>
         </w:trPr>
@@ -6545,17 +6869,7 @@
                 <w:sz w:val="20"/>
                 <w:szCs w:val="20"/>
               </w:rPr>
-              <w:t xml:space="preserve">Document </w:t>
-            </w:r>
-            <w:r>
-              <w:rPr>
-                <w:b/>
-                <w:bCs/>
-                <w:color w:val="FFFFFF"/>
-                <w:sz w:val="20"/>
-                <w:szCs w:val="20"/>
-              </w:rPr>
-              <w:t>Version</w:t>
+              <w:t>Document Version</w:t>
             </w:r>
           </w:p>
         </w:tc>
@@ -6654,12 +6968,6 @@
         </w:tc>
       </w:tr>
       <w:tr>
-        <w:tblPrEx>
-          <w:tblCellMar>
-            <w:top w:w="0" w:type="dxa"/>
-            <w:bottom w:w="0" w:type="dxa"/>
-          </w:tblCellMar>
-        </w:tblPrEx>
         <w:tc>
           <w:tcPr>
             <w:tcW w:w="2340" w:type="dxa"/>
@@ -6772,6 +7080,140 @@
                 <w:szCs w:val="20"/>
               </w:rPr>
               <w:t>First draft — 4-service architecture with ES256 JWT</w:t>
+            </w:r>
+          </w:p>
+        </w:tc>
+      </w:tr>
+      <w:tr>
+        <w:tc>
+          <w:tcPr>
+            <w:tcW w:w="2340" w:type="dxa"/>
+            <w:tcBorders>
+              <w:top w:val="single" w:sz="1" w:space="0" w:color="CCCCCC"/>
+              <w:left w:val="single" w:sz="1" w:space="0" w:color="CCCCCC"/>
+              <w:bottom w:val="single" w:sz="1" w:space="0" w:color="CCCCCC"/>
+              <w:right w:val="single" w:sz="1" w:space="0" w:color="CCCCCC"/>
+            </w:tcBorders>
+            <w:shd w:val="clear" w:color="auto" w:fill="FFFFFF"/>
+            <w:tcMar>
+              <w:top w:w="80" w:type="dxa"/>
+              <w:left w:w="120" w:type="dxa"/>
+              <w:bottom w:w="80" w:type="dxa"/>
+              <w:right w:w="120" w:type="dxa"/>
+            </w:tcMar>
+          </w:tcPr>
+          <w:p>
+            <w:pPr>
+              <w:rPr>
+                <w:sz w:val="20"/>
+                <w:szCs w:val="20"/>
+              </w:rPr>
+            </w:pPr>
+            <w:r>
+              <w:rPr>
+                <w:sz w:val="20"/>
+                <w:szCs w:val="20"/>
+              </w:rPr>
+              <w:t>1.1</w:t>
+            </w:r>
+          </w:p>
+        </w:tc>
+        <w:tc>
+          <w:tcPr>
+            <w:tcW w:w="2340" w:type="dxa"/>
+            <w:tcBorders>
+              <w:top w:val="single" w:sz="1" w:space="0" w:color="CCCCCC"/>
+              <w:left w:val="single" w:sz="1" w:space="0" w:color="CCCCCC"/>
+              <w:bottom w:val="single" w:sz="1" w:space="0" w:color="CCCCCC"/>
+              <w:right w:val="single" w:sz="1" w:space="0" w:color="CCCCCC"/>
+            </w:tcBorders>
+            <w:shd w:val="clear" w:color="auto" w:fill="FFFFFF"/>
+            <w:tcMar>
+              <w:top w:w="80" w:type="dxa"/>
+              <w:left w:w="120" w:type="dxa"/>
+              <w:bottom w:w="80" w:type="dxa"/>
+              <w:right w:w="120" w:type="dxa"/>
+            </w:tcMar>
+          </w:tcPr>
+          <w:p>
+            <w:pPr>
+              <w:rPr>
+                <w:sz w:val="20"/>
+                <w:szCs w:val="20"/>
+              </w:rPr>
+            </w:pPr>
+            <w:r>
+              <w:rPr>
+                <w:sz w:val="20"/>
+                <w:szCs w:val="20"/>
+              </w:rPr>
+              <w:t>2026-05-26</w:t>
+            </w:r>
+          </w:p>
+        </w:tc>
+        <w:tc>
+          <w:tcPr>
+            <w:tcW w:w="2340" w:type="dxa"/>
+            <w:tcBorders>
+              <w:top w:val="single" w:sz="1" w:space="0" w:color="CCCCCC"/>
+              <w:left w:val="single" w:sz="1" w:space="0" w:color="CCCCCC"/>
+              <w:bottom w:val="single" w:sz="1" w:space="0" w:color="CCCCCC"/>
+              <w:right w:val="single" w:sz="1" w:space="0" w:color="CCCCCC"/>
+            </w:tcBorders>
+            <w:shd w:val="clear" w:color="auto" w:fill="FFFFFF"/>
+            <w:tcMar>
+              <w:top w:w="80" w:type="dxa"/>
+              <w:left w:w="120" w:type="dxa"/>
+              <w:bottom w:w="80" w:type="dxa"/>
+              <w:right w:w="120" w:type="dxa"/>
+            </w:tcMar>
+          </w:tcPr>
+          <w:p>
+            <w:pPr>
+              <w:rPr>
+                <w:sz w:val="20"/>
+                <w:szCs w:val="20"/>
+              </w:rPr>
+            </w:pPr>
+            <w:r>
+              <w:rPr>
+                <w:sz w:val="20"/>
+                <w:szCs w:val="20"/>
+              </w:rPr>
+              <w:t>Julian Korgol</w:t>
+            </w:r>
+          </w:p>
+        </w:tc>
+        <w:tc>
+          <w:tcPr>
+            <w:tcW w:w="2340" w:type="dxa"/>
+            <w:tcBorders>
+              <w:top w:val="single" w:sz="1" w:space="0" w:color="CCCCCC"/>
+              <w:left w:val="single" w:sz="1" w:space="0" w:color="CCCCCC"/>
+              <w:bottom w:val="single" w:sz="1" w:space="0" w:color="CCCCCC"/>
+              <w:right w:val="single" w:sz="1" w:space="0" w:color="CCCCCC"/>
+            </w:tcBorders>
+            <w:shd w:val="clear" w:color="auto" w:fill="FFFFFF"/>
+            <w:tcMar>
+              <w:top w:w="80" w:type="dxa"/>
+              <w:left w:w="120" w:type="dxa"/>
+              <w:bottom w:w="80" w:type="dxa"/>
+              <w:right w:w="120" w:type="dxa"/>
+            </w:tcMar>
+          </w:tcPr>
+          <w:p>
+            <w:pPr>
+              <w:rPr>
+                <w:sz w:val="20"/>
+                <w:szCs w:val="20"/>
+              </w:rPr>
+            </w:pPr>
+            <w:r>
+              <w:rPr>
+                <w:sz w:val="20"/>
+                <w:szCs w:val="20"/>
+              </w:rPr>
+              <w:t>IAM Microservice changes</w:t>
             </w:r>
           </w:p>
         </w:tc>
@@ -6908,15 +7350,7 @@
         <w:sz w:val="18"/>
         <w:szCs w:val="18"/>
       </w:rPr>
-      <w:t>Movie Reservation System</w:t>
-    </w:r>
-    <w:r>
-      <w:rPr>
-        <w:color w:val="888888"/>
-        <w:sz w:val="18"/>
-        <w:szCs w:val="18"/>
-      </w:rPr>
-      <w:t xml:space="preserve"> — Microservices Architecture</w:t>
+      <w:t>Movie Reservation System — Microservices Architecture</w:t>
     </w:r>
   </w:p>
 </w:hdr>

</xml_diff>

<commit_message>
docs[backend]: update iam microservice db to 1.2.0 version
</commit_message>
<xml_diff>
--- a/docs/backend/movie-reservation-system_backend-architecture.docx
+++ b/docs/backend/movie-reservation-system_backend-architecture.docx
@@ -1489,6 +1489,111 @@
           </w:p>
         </w:tc>
       </w:tr>
+      <w:tr>
+        <w:tc>
+          <w:tcPr>
+            <w:tcW w:w="3120" w:type="dxa"/>
+            <w:tcBorders>
+              <w:top w:val="single" w:sz="1" w:space="0" w:color="CCCCCC"/>
+              <w:left w:val="single" w:sz="1" w:space="0" w:color="CCCCCC"/>
+              <w:bottom w:val="single" w:sz="1" w:space="0" w:color="CCCCCC"/>
+              <w:right w:val="single" w:sz="1" w:space="0" w:color="CCCCCC"/>
+            </w:tcBorders>
+            <w:shd w:val="clear" w:color="auto" w:fill="F2F5FA"/>
+            <w:tcMar>
+              <w:top w:w="80" w:type="dxa"/>
+              <w:left w:w="120" w:type="dxa"/>
+              <w:bottom w:w="80" w:type="dxa"/>
+              <w:right w:w="120" w:type="dxa"/>
+            </w:tcMar>
+          </w:tcPr>
+          <w:p>
+            <w:pPr>
+              <w:rPr>
+                <w:sz w:val="20"/>
+                <w:szCs w:val="20"/>
+              </w:rPr>
+            </w:pPr>
+            <w:proofErr w:type="spellStart"/>
+            <w:r>
+              <w:rPr>
+                <w:sz w:val="20"/>
+                <w:szCs w:val="20"/>
+              </w:rPr>
+              <w:t>sudo_mode</w:t>
+            </w:r>
+            <w:proofErr w:type="spellEnd"/>
+          </w:p>
+        </w:tc>
+        <w:tc>
+          <w:tcPr>
+            <w:tcW w:w="3120" w:type="dxa"/>
+            <w:tcBorders>
+              <w:top w:val="single" w:sz="1" w:space="0" w:color="CCCCCC"/>
+              <w:left w:val="single" w:sz="1" w:space="0" w:color="CCCCCC"/>
+              <w:bottom w:val="single" w:sz="1" w:space="0" w:color="CCCCCC"/>
+              <w:right w:val="single" w:sz="1" w:space="0" w:color="CCCCCC"/>
+            </w:tcBorders>
+            <w:shd w:val="clear" w:color="auto" w:fill="F2F5FA"/>
+            <w:tcMar>
+              <w:top w:w="80" w:type="dxa"/>
+              <w:left w:w="120" w:type="dxa"/>
+              <w:bottom w:w="80" w:type="dxa"/>
+              <w:right w:w="120" w:type="dxa"/>
+            </w:tcMar>
+          </w:tcPr>
+          <w:p>
+            <w:pPr>
+              <w:rPr>
+                <w:sz w:val="20"/>
+                <w:szCs w:val="20"/>
+              </w:rPr>
+            </w:pPr>
+            <w:proofErr w:type="spellStart"/>
+            <w:r>
+              <w:rPr>
+                <w:sz w:val="20"/>
+                <w:szCs w:val="20"/>
+              </w:rPr>
+              <w:t>boolean</w:t>
+            </w:r>
+            <w:proofErr w:type="spellEnd"/>
+          </w:p>
+        </w:tc>
+        <w:tc>
+          <w:tcPr>
+            <w:tcW w:w="3120" w:type="dxa"/>
+            <w:tcBorders>
+              <w:top w:val="single" w:sz="1" w:space="0" w:color="CCCCCC"/>
+              <w:left w:val="single" w:sz="1" w:space="0" w:color="CCCCCC"/>
+              <w:bottom w:val="single" w:sz="1" w:space="0" w:color="CCCCCC"/>
+              <w:right w:val="single" w:sz="1" w:space="0" w:color="CCCCCC"/>
+            </w:tcBorders>
+            <w:shd w:val="clear" w:color="auto" w:fill="F2F5FA"/>
+            <w:tcMar>
+              <w:top w:w="80" w:type="dxa"/>
+              <w:left w:w="120" w:type="dxa"/>
+              <w:bottom w:w="80" w:type="dxa"/>
+              <w:right w:w="120" w:type="dxa"/>
+            </w:tcMar>
+          </w:tcPr>
+          <w:p>
+            <w:pPr>
+              <w:rPr>
+                <w:sz w:val="20"/>
+                <w:szCs w:val="20"/>
+              </w:rPr>
+            </w:pPr>
+            <w:r>
+              <w:rPr>
+                <w:sz w:val="20"/>
+                <w:szCs w:val="20"/>
+              </w:rPr>
+              <w:t>Allows critical operations e.g. email change</w:t>
+            </w:r>
+          </w:p>
+        </w:tc>
+      </w:tr>
     </w:tbl>
     <w:p/>
     <w:p>
@@ -1502,6 +1607,20 @@
       <w:proofErr w:type="spellEnd"/>
       <w:r>
         <w:t xml:space="preserve"> of the active access token is added to a Redis blocklist with a TTL matching the remaining token lifetime.</w:t>
+      </w:r>
+    </w:p>
+    <w:p/>
+    <w:p>
+      <w:r>
+        <w:t xml:space="preserve">Refresh tokens and Access tokens with </w:t>
+      </w:r>
+      <w:proofErr w:type="spellStart"/>
+      <w:r>
+        <w:t>sudo</w:t>
+      </w:r>
+      <w:proofErr w:type="spellEnd"/>
+      <w:r>
+        <w:t xml:space="preserve"> mode are valid only for 30 minutes.</w:t>
       </w:r>
     </w:p>
     <w:p/>
@@ -1517,7 +1636,6 @@
         <w:pStyle w:val="Heading1"/>
       </w:pPr>
       <w:r>
-        <w:lastRenderedPageBreak/>
         <w:t>3. IAM Service</w:t>
       </w:r>
     </w:p>
@@ -2813,7 +2931,6 @@
         <w:pStyle w:val="Heading1"/>
       </w:pPr>
       <w:r>
-        <w:lastRenderedPageBreak/>
         <w:t>4. Location Service</w:t>
       </w:r>
     </w:p>

</xml_diff>